<commit_message>
fix: les épinglages doivent tenir sur Python 3.11, pas seulement 3.12
Régression introduite au module 7 : les versions avaient été relevées depuis
un venv Python 3.12, alors que l'image Docker est en 3.11 — le plancher
déclaré par pyproject.toml. `numpy==2.5.1` exige 3.12, le build de l'image
échouait donc, sans que rien ne le signale (tests, ruff et CI tournent tous
en 3.12).

- numpy ramené à 2.4.6, dernière version compatible 3.11 ; 413 tests repassés
- la CI construit désormais l'image Docker : c'est le seul travail qui voit
  ce que voit le déploiement
- requirements.txt porte la commande de vérification sur 3.11

Trouvé en lançant la stack docker compose, pas par les tests.

Co-Authored-By: Claude Opus 5 <noreply@anthropic.com>
</commit_message>
<xml_diff>
--- a/docs/livrables/JOURNAL_FUSION.docx
+++ b/docs/livrables/JOURNAL_FUSION.docx
@@ -8399,6 +8399,43 @@
           </w:p>
         </w:tc>
       </w:tr>
+      <w:tr>
+        <w:tc>
+          <w:tcPr>
+            <w:tcW w:type="dxa" w:w="4873"/>
+          </w:tcPr>
+          <w:p>
+            <w:pPr>
+              <w:spacing w:after="40" w:before="40"/>
+            </w:pPr>
+            <w:r/>
+            <w:r>
+              <w:rPr>
+                <w:b/>
+                <w:sz w:val="18"/>
+              </w:rPr>
+              <w:t>Build de l'image Docker</w:t>
+            </w:r>
+          </w:p>
+        </w:tc>
+        <w:tc>
+          <w:tcPr>
+            <w:tcW w:type="dxa" w:w="4873"/>
+          </w:tcPr>
+          <w:p>
+            <w:pPr>
+              <w:spacing w:after="40" w:before="40"/>
+            </w:pPr>
+            <w:r/>
+            <w:r>
+              <w:rPr>
+                <w:sz w:val="18"/>
+              </w:rPr>
+              <w:t>Elle tourne en Python 3.11 quand tout le reste est en 3.12</w:t>
+            </w:r>
+          </w:p>
+        </w:tc>
+      </w:tr>
     </w:tbl>
     <w:p>
       <w:pPr>
@@ -8494,7 +8531,60 @@
         <w:pStyle w:val="Heading2"/>
       </w:pPr>
       <w:r>
-        <w:t>Impact sur le reste du projet</w:t>
+        <w:t>Correctif apporté après coup : les épinglages et Python 3.11</w:t>
+      </w:r>
+    </w:p>
+    <w:p>
+      <w:r>
+        <w:t xml:space="preserve">L'épinglage décrit plus haut a introduit une régression, trouvée en lançant la stack Docker : les versions avaient été relevées depuis un environnement </w:t>
+      </w:r>
+      <w:r>
+        <w:rPr>
+          <w:b/>
+        </w:rPr>
+        <w:t>Python 3.12</w:t>
+      </w:r>
+      <w:r>
+        <w:t xml:space="preserve">, alors que l'image Docker est en </w:t>
+      </w:r>
+      <w:r>
+        <w:rPr>
+          <w:b/>
+        </w:rPr>
+        <w:t>3.11</w:t>
+      </w:r>
+      <w:r>
+        <w:t xml:space="preserve"> — le plancher déclaré par le projet. </w:t>
+      </w:r>
+      <w:r>
+        <w:rPr>
+          <w:rFonts w:ascii="Consolas" w:hAnsi="Consolas"/>
+          <w:color w:val="0B3D91"/>
+          <w:sz w:val="18"/>
+        </w:rPr>
+        <w:t>numpy==2.5.1</w:t>
+      </w:r>
+      <w:r>
+        <w:t xml:space="preserve"> exige 3.12 : le build de l'image échouait.</w:t>
+      </w:r>
+    </w:p>
+    <w:p>
+      <w:r>
+        <w:t xml:space="preserve">Le point instructif est que </w:t>
+      </w:r>
+      <w:r>
+        <w:rPr>
+          <w:b/>
+        </w:rPr>
+        <w:t>rien ne le signalait</w:t>
+      </w:r>
+      <w:r>
+        <w:t xml:space="preserve"> : les tests passaient, l'analyse statique aussi, et l'intégration continue elle-même tournait sur 3.12. Le seul chemin qui voyait le problème était celui du déploiement.</w:t>
+      </w:r>
+    </w:p>
+    <w:p>
+      <w:r>
+        <w:t>Deux corrections :</w:t>
       </w:r>
     </w:p>
     <w:p>
@@ -8503,7 +8593,117 @@
         <w:spacing w:after="40"/>
       </w:pPr>
       <w:r>
-        <w:t>**Toute proposition de modification passe désormais par ces quatre</w:t>
+        <w:rPr>
+          <w:rFonts w:ascii="Consolas" w:hAnsi="Consolas"/>
+          <w:color w:val="0B3D91"/>
+          <w:sz w:val="18"/>
+        </w:rPr>
+        <w:t>numpy</w:t>
+      </w:r>
+      <w:r>
+        <w:t xml:space="preserve"> ramené à </w:t>
+      </w:r>
+      <w:r>
+        <w:rPr>
+          <w:rFonts w:ascii="Consolas" w:hAnsi="Consolas"/>
+          <w:color w:val="0B3D91"/>
+          <w:sz w:val="18"/>
+        </w:rPr>
+        <w:t>2.4.6</w:t>
+      </w:r>
+      <w:r>
+        <w:t>, la dernière version compatible 3.11 ; la suite de</w:t>
+      </w:r>
+    </w:p>
+    <w:p>
+      <w:r>
+        <w:t>tests repassée (413) après alignement du venv local ;</w:t>
+      </w:r>
+    </w:p>
+    <w:p>
+      <w:pPr>
+        <w:pStyle w:val="ListBullet"/>
+        <w:spacing w:after="40"/>
+      </w:pPr>
+      <w:r>
+        <w:rPr>
+          <w:b/>
+        </w:rPr>
+        <w:t>l'intégration continue construit désormais l'image Docker</w:t>
+      </w:r>
+      <w:r>
+        <w:t>. C'est le seul</w:t>
+      </w:r>
+    </w:p>
+    <w:p>
+      <w:r>
+        <w:t>moyen de vérifier ce que voit réellement le déploiement.</w:t>
+      </w:r>
+    </w:p>
+    <w:p>
+      <w:r>
+        <w:t xml:space="preserve">Le fichier </w:t>
+      </w:r>
+      <w:r>
+        <w:rPr>
+          <w:rFonts w:ascii="Consolas" w:hAnsi="Consolas"/>
+          <w:color w:val="0B3D91"/>
+          <w:sz w:val="18"/>
+        </w:rPr>
+        <w:t>requirements.txt</w:t>
+      </w:r>
+      <w:r>
+        <w:t xml:space="preserve"> porte maintenant la commande de vérification :</w:t>
+      </w:r>
+    </w:p>
+    <w:p>
+      <w:pPr>
+        <w:spacing w:after="0" w:before="0" w:line="240" w:lineRule="auto"/>
+        <w:ind w:left="227"/>
+        <w:shd w:val="clear" w:fill="F4F4F5"/>
+      </w:pPr>
+      <w:r>
+        <w:rPr>
+          <w:rFonts w:ascii="Consolas" w:hAnsi="Consolas"/>
+          <w:sz w:val="17"/>
+        </w:rPr>
+        <w:t>docker run --rm -v "$PWD/requirements.txt:/r.txt:ro" python:3.11-slim \</w:t>
+      </w:r>
+    </w:p>
+    <w:p>
+      <w:pPr>
+        <w:spacing w:after="0" w:before="0" w:line="240" w:lineRule="auto"/>
+        <w:ind w:left="227"/>
+        <w:shd w:val="clear" w:fill="F4F4F5"/>
+      </w:pPr>
+      <w:r>
+        <w:rPr>
+          <w:rFonts w:ascii="Consolas" w:hAnsi="Consolas"/>
+          <w:sz w:val="17"/>
+        </w:rPr>
+        <w:t xml:space="preserve">  pip install --dry-run -q -r /r.txt</w:t>
+      </w:r>
+    </w:p>
+    <w:p>
+      <w:pPr>
+        <w:spacing w:after="80"/>
+      </w:pPr>
+    </w:p>
+    <w:p>
+      <w:pPr>
+        <w:pStyle w:val="Heading2"/>
+      </w:pPr>
+      <w:r>
+        <w:t>Impact sur le reste du projet</w:t>
+      </w:r>
+    </w:p>
+    <w:p>
+      <w:pPr>
+        <w:pStyle w:val="ListBullet"/>
+        <w:spacing w:after="40"/>
+      </w:pPr>
+      <w:r>
+        <w:t>**Toute proposition de modification passe désormais par ces cinq</w:t>
       </w:r>
     </w:p>
     <w:p>

</xml_diff>